<commit_message>
chore: cambio nombres de archivos
</commit_message>
<xml_diff>
--- a/Docu_TFG/Ignorar_git/VecindApp_Guion_Defensa.docx
+++ b/Docu_TFG/Ignorar_git/VecindApp_Guion_Defensa.docx
@@ -1493,7 +1493,13 @@
         <w:t xml:space="preserve">Patrón aplicado: </w:t>
       </w:r>
       <w:r>
-        <w:t>MVVM + Clean Architecture para un código escalable y mantenible.</w:t>
+        <w:t>MVVM + Clean Architecture</w:t>
+      </w:r>
+      <w:r>
+        <w:t>(busca organizar el código en capas)</w:t>
+      </w:r>
+      <w:r>
+        <w:t xml:space="preserve"> para un código escalable y mantenible.</w:t>
       </w:r>
     </w:p>
     <w:p>
@@ -1615,6 +1621,7 @@
           <w:i/>
           <w:iCs/>
         </w:rPr>
+        <w:lastRenderedPageBreak/>
         <w:t>«Veremos al final qué objetivos se cumplieron y cuáles se superaron en alcance.»</w:t>
       </w:r>
     </w:p>
@@ -2076,16 +2083,13 @@
         <w:jc w:val="both"/>
       </w:pPr>
       <w:r>
-        <w:t>«Ninguna plataforma de banco de tiempo existente incorpora pictogramas, lectura fácil o diseño pensado para discapacidad cognitiva. Del mismo modo, ninguna aplicación vecinal integra TTS activo en su propia interfaz.»</w:t>
-      </w:r>
-    </w:p>
-    <w:p>
-      <w:pPr>
-        <w:spacing w:after="120"/>
-        <w:jc w:val="both"/>
-      </w:pPr>
-      <w:r>
-        <w:t>«Ese es el nicho que VecindApp ocupa, y lo hace con un enfoque offline-first que elimina la dependencia de un backend remoto.»</w:t>
+        <w:t>«</w:t>
+      </w:r>
+      <w:r>
+        <w:t>Ninguna plataforma de banco de tiempo incorpora pictogramas o TTS. Ninguna app vecinal integra accesibilidad activa. Para esta presentación VecindApp se ha preparado con enfoque offline-first. (Sin necesidad de internet)</w:t>
+      </w:r>
+      <w:r>
+        <w:t>.»</w:t>
       </w:r>
     </w:p>
     <w:p/>
@@ -2227,7 +2231,13 @@
         </w:numPr>
       </w:pPr>
       <w:r>
-        <w:t>Se conservaron los elementos útiles: sprints de duración fija, backlog priorizado y posibilidad de adelantar trabajo.</w:t>
+        <w:t>Se conservaron los elementos útiles: sprints de duración fija, backlog</w:t>
+      </w:r>
+      <w:r>
+        <w:t xml:space="preserve"> (tareas pensadas con anterioridad)</w:t>
+      </w:r>
+      <w:r>
+        <w:t xml:space="preserve"> priorizado y posibilidad de adelantar trabajo.</w:t>
       </w:r>
     </w:p>
     <w:p>
@@ -2240,6 +2250,15 @@
       </w:pPr>
       <w:r>
         <w:t>Seguimiento visual tipo Kanban: pendiente / en curso / hecho.</w:t>
+      </w:r>
+      <w:r>
+        <w:t xml:space="preserve"> [Em verdad esto no ha sido así</w:t>
+      </w:r>
+      <w:r>
+        <w:t xml:space="preserve"> +cambiar</w:t>
+      </w:r>
+      <w:r>
+        <w:t>]</w:t>
       </w:r>
     </w:p>
     <w:p>
@@ -2703,7 +2722,25 @@
         </w:numPr>
       </w:pPr>
       <w:r>
-        <w:t>El Sprint 6 se redujo: se priorizaron las notificaciones reactivas frente al WorkManager.</w:t>
+        <w:t xml:space="preserve">El Sprint </w:t>
+      </w:r>
+      <w:r>
+        <w:t>2 &amp; 3</w:t>
+      </w:r>
+      <w:r>
+        <w:t xml:space="preserve"> se redujo</w:t>
+      </w:r>
+      <w:r>
+        <w:t xml:space="preserve"> por avances en el S1.  El S6 se alargó por diferentes bugs y donde se tuvo que </w:t>
+      </w:r>
+      <w:r>
+        <w:t>priorizar</w:t>
+      </w:r>
+      <w:r>
+        <w:t xml:space="preserve"> </w:t>
+      </w:r>
+      <w:r>
+        <w:t>las notificaciones reactivas frente al WorkManager.</w:t>
       </w:r>
     </w:p>
     <w:p>
@@ -2927,6 +2964,7 @@
         </w:numPr>
       </w:pPr>
       <w:r>
+        <w:lastRenderedPageBreak/>
         <w:t>&lt;&lt;include&gt;&gt; del CU-10 hacia la validación de saldo, obligatoria y compartida con el CU-09 (solicitar servicio).</w:t>
       </w:r>
     </w:p>
@@ -6125,7 +6163,6 @@
   <w:style w:type="character" w:default="1" w:styleId="Fuentedeprrafopredeter">
     <w:name w:val="Default Paragraph Font"/>
     <w:uiPriority w:val="1"/>
-    <w:semiHidden/>
     <w:unhideWhenUsed/>
   </w:style>
   <w:style w:type="table" w:default="1" w:styleId="Tablanormal">

</xml_diff>